<commit_message>
Complete Phase 5 REDCap candidate package
</commit_message>
<xml_diff>
--- a/preregistration/package/05_training_and_pilot/DEA_coder_training_handout_embedded_examples_CODER_v1.docx
+++ b/preregistration/package/05_training_and_pilot/DEA_coder_training_handout_embedded_examples_CODER_v1.docx
@@ -1,6 +1,6 @@
 
 <file path=word/document.xml><?xml version="1.0" encoding="utf-8"?>
-<w:document xmlns:mc="http://schemas.openxmlformats.org/markup-compatibility/2006" xmlns:o="urn:schemas-microsoft-com:office:office" xmlns:r="http://schemas.openxmlformats.org/officeDocument/2006/relationships" xmlns:m="http://schemas.openxmlformats.org/officeDocument/2006/math" xmlns:v="urn:schemas-microsoft-com:vml" xmlns:wp="http://schemas.openxmlformats.org/drawingml/2006/wordprocessingDrawing" xmlns:w10="urn:schemas-microsoft-com:office:word" xmlns:w="http://schemas.openxmlformats.org/wordprocessingml/2006/main" xmlns:wne="http://schemas.microsoft.com/office/word/2006/wordml" xmlns:sl="http://schemas.openxmlformats.org/schemaLibrary/2006/main" xmlns:a="http://schemas.openxmlformats.org/drawingml/2006/main" xmlns:pic="http://schemas.openxmlformats.org/drawingml/2006/picture" xmlns:c="http://schemas.openxmlformats.org/drawingml/2006/chart" xmlns:lc="http://schemas.openxmlformats.org/drawingml/2006/lockedCanvas" xmlns:dgm="http://schemas.openxmlformats.org/drawingml/2006/diagram" xmlns:wps="http://schemas.microsoft.com/office/word/2010/wordprocessingShape" xmlns:wpg="http://schemas.microsoft.com/office/word/2010/wordprocessingGroup" xmlns:w14="http://schemas.microsoft.com/office/word/2010/wordml" xmlns:w15="http://schemas.microsoft.com/office/word/2012/wordml" xmlns:w16="http://schemas.microsoft.com/office/word/2018/wordml" xmlns:w16cex="http://schemas.microsoft.com/office/word/2018/wordml/cex" xmlns:w16cid="http://schemas.microsoft.com/office/word/2016/wordml/cid" xmlns="http://schemas.microsoft.com/office/tasks/2019/documenttasks" xmlns:cr="http://schemas.microsoft.com/office/comments/2020/reactions">
+<w:document xmlns:ns2="http://schemas.openxmlformats.org/officeDocument/2006/relationships" xmlns:w="http://schemas.openxmlformats.org/wordprocessingml/2006/main" xmlns:w14="http://schemas.microsoft.com/office/word/2010/wordml">
   <w:body>
     <w:p>
       <w:pPr>
@@ -10139,7 +10139,7 @@
           <w:szCs w:val="28"/>
           <w:rtl w:val="0"/>
         </w:rPr>
-        <w:t xml:space="preserve">Fields you will see but not edit</w:t>
+        <w:t xml:space="preserve">Fields used in REDCap</w:t>
       </w:r>
     </w:p>
     <w:sdt>
@@ -10242,7 +10242,7 @@
                     <w:szCs w:val="17"/>
                     <w:rtl w:val="0"/>
                   </w:rPr>
-                  <w:t xml:space="preserve">What it means</w:t>
+                  <w:t xml:space="preserve">Coder visibility and purpose</w:t>
                 </w:r>
               </w:p>
             </w:tc>
@@ -10313,7 +10313,7 @@
                     <w:szCs w:val="17"/>
                     <w:rtl w:val="0"/>
                   </w:rPr>
-                  <w:t xml:space="preserve">Unique assignment ID, e.g. </w:t>
+                  <w:t xml:space="preserve">Visible: neutral opaque code identifying this assignment, e.g. A7K3M9Q2</w:t>
                 </w:r>
                 <w:r>
                   <w:rPr>
@@ -10323,7 +10323,7 @@
                     <w:szCs w:val="17"/>
                     <w:rtl w:val="0"/>
                   </w:rPr>
-                  <w:t xml:space="preserve">baseline_C02_2024_123</w:t>
+                  <w:t xml:space="preserve"/>
                 </w:r>
                 <w:r>
                   <w:rPr>
@@ -10365,7 +10365,7 @@
                     <w:szCs w:val="17"/>
                     <w:rtl w:val="0"/>
                   </w:rPr>
-                  <w:t xml:space="preserve">coder_id</w:t>
+                  <w:t xml:space="preserve">project_title</w:t>
                 </w:r>
                 <w:r>
                   <w:rPr>
@@ -10399,7 +10399,22 @@
                     <w:szCs w:val="17"/>
                     <w:rtl w:val="0"/>
                   </w:rPr>
-                  <w:t xml:space="preserve">Your anonymised coder ID</w:t>
+                  <w:t xml:space="preserve">Visible, read-only: public register project title</w:t>
+                </w:r>
+                <w:r>
+                  <w:rPr>
+                    <w:rFonts w:ascii="Roboto Mono" w:cs="Roboto Mono" w:eastAsia="Roboto Mono" w:hAnsi="Roboto Mono"/>
+                    <w:color w:val="188038"/>
+                    <w:sz w:val="17"/>
+                    <w:szCs w:val="17"/>
+                    <w:rtl w:val="0"/>
+                  </w:rPr>
+                  <w:t xml:space="preserve"/>
+                </w:r>
+                <w:r>
+                  <w:rPr>
+                    <w:rtl w:val="0"/>
+                  </w:rPr>
                 </w:r>
               </w:p>
             </w:tc>
@@ -10436,7 +10451,7 @@
                     <w:szCs w:val="17"/>
                     <w:rtl w:val="0"/>
                   </w:rPr>
-                  <w:t xml:space="preserve">record_id</w:t>
+                  <w:t xml:space="preserve">datasets_used</w:t>
                 </w:r>
                 <w:r>
                   <w:rPr>
@@ -10470,7 +10485,22 @@
                     <w:szCs w:val="17"/>
                     <w:rtl w:val="0"/>
                   </w:rPr>
-                  <w:t xml:space="preserve">DEA project ID from the public register</w:t>
+                  <w:t xml:space="preserve">Visible, read-only: public register datasets-used entry</w:t>
+                </w:r>
+                <w:r>
+                  <w:rPr>
+                    <w:rFonts w:ascii="Roboto Mono" w:cs="Roboto Mono" w:eastAsia="Roboto Mono" w:hAnsi="Roboto Mono"/>
+                    <w:color w:val="188038"/>
+                    <w:sz w:val="17"/>
+                    <w:szCs w:val="17"/>
+                    <w:rtl w:val="0"/>
+                  </w:rPr>
+                  <w:t xml:space="preserve"/>
+                </w:r>
+                <w:r>
+                  <w:rPr>
+                    <w:rtl w:val="0"/>
+                  </w:rPr>
                 </w:r>
               </w:p>
             </w:tc>
@@ -10507,7 +10537,7 @@
                     <w:szCs w:val="17"/>
                     <w:rtl w:val="0"/>
                   </w:rPr>
-                  <w:t xml:space="preserve">project_title</w:t>
+                  <w:t xml:space="preserve">reviewer_id / coder_id</w:t>
                 </w:r>
                 <w:r>
                   <w:rPr>
@@ -10541,7 +10571,22 @@
                     <w:szCs w:val="17"/>
                     <w:rtl w:val="0"/>
                   </w:rPr>
-                  <w:t xml:space="preserve">Public register project title</w:t>
+                  <w:t xml:space="preserve">Hidden: administrative reviewer linkage</w:t>
+                </w:r>
+                <w:r>
+                  <w:rPr>
+                    <w:rFonts w:ascii="Roboto Mono" w:cs="Roboto Mono" w:eastAsia="Roboto Mono" w:hAnsi="Roboto Mono"/>
+                    <w:color w:val="188038"/>
+                    <w:sz w:val="17"/>
+                    <w:szCs w:val="17"/>
+                    <w:rtl w:val="0"/>
+                  </w:rPr>
+                  <w:t xml:space="preserve"/>
+                </w:r>
+                <w:r>
+                  <w:rPr>
+                    <w:rtl w:val="0"/>
+                  </w:rPr>
                 </w:r>
               </w:p>
             </w:tc>
@@ -10578,7 +10623,7 @@
                     <w:szCs w:val="17"/>
                     <w:rtl w:val="0"/>
                   </w:rPr>
-                  <w:t xml:space="preserve">datasets_used</w:t>
+                  <w:t xml:space="preserve">record_id</w:t>
                 </w:r>
                 <w:r>
                   <w:rPr>
@@ -10612,7 +10657,280 @@
                     <w:szCs w:val="17"/>
                     <w:rtl w:val="0"/>
                   </w:rPr>
-                  <w:t xml:space="preserve">Public register dataset field</w:t>
+                  <w:t xml:space="preserve">Hidden: stable source-record linkage</w:t>
+                </w:r>
+                <w:r>
+                  <w:rPr>
+                    <w:rFonts w:ascii="Roboto Mono" w:cs="Roboto Mono" w:eastAsia="Roboto Mono" w:hAnsi="Roboto Mono"/>
+                    <w:color w:val="188038"/>
+                    <w:sz w:val="17"/>
+                    <w:szCs w:val="17"/>
+                    <w:rtl w:val="0"/>
+                  </w:rPr>
+                  <w:t xml:space="preserve"/>
+                </w:r>
+                <w:r>
+                  <w:rPr>
+                    <w:rtl w:val="0"/>
+                  </w:rPr>
+                </w:r>
+              </w:p>
+            </w:tc>
+          </w:tr>
+          <w:tr>
+            <w:trPr>
+              <w:cantSplit w:val="0"/>
+              <w:tblHeader w:val="0"/>
+            </w:trPr>
+            <w:tc>
+              <w:tcPr>
+                <w:shd w:fill="auto" w:val="clear"/>
+                <w:tcMar>
+                  <w:top w:w="100.0" w:type="dxa"/>
+                  <w:left w:w="100.0" w:type="dxa"/>
+                  <w:bottom w:w="100.0" w:type="dxa"/>
+                  <w:right w:w="100.0" w:type="dxa"/>
+                </w:tcMar>
+                <w:vAlign w:val="top"/>
+              </w:tcPr>
+              <w:p>
+                <w:pPr>
+                  <w:spacing w:after="0" w:line="276" w:lineRule="auto"/>
+                  <w:rPr>
+                    <w:sz w:val="17"/>
+                    <w:szCs w:val="17"/>
+                  </w:rPr>
+                </w:pPr>
+                <w:r>
+                  <w:rPr>
+                    <w:rFonts w:ascii="Roboto Mono" w:cs="Roboto Mono" w:eastAsia="Roboto Mono" w:hAnsi="Roboto Mono"/>
+                    <w:color w:val="188038"/>
+                    <w:sz w:val="17"/>
+                    <w:szCs w:val="17"/>
+                    <w:rtl w:val="0"/>
+                  </w:rPr>
+                  <w:t xml:space="preserve">official_project_id</w:t>
+                </w:r>
+                <w:r>
+                  <w:rPr>
+                    <w:rtl w:val="0"/>
+                  </w:rPr>
+                </w:r>
+              </w:p>
+            </w:tc>
+            <w:tc>
+              <w:tcPr>
+                <w:shd w:fill="auto" w:val="clear"/>
+                <w:tcMar>
+                  <w:top w:w="100.0" w:type="dxa"/>
+                  <w:left w:w="100.0" w:type="dxa"/>
+                  <w:bottom w:w="100.0" w:type="dxa"/>
+                  <w:right w:w="100.0" w:type="dxa"/>
+                </w:tcMar>
+                <w:vAlign w:val="top"/>
+              </w:tcPr>
+              <w:p>
+                <w:pPr>
+                  <w:spacing w:after="0" w:line="276" w:lineRule="auto"/>
+                  <w:rPr>
+                    <w:sz w:val="17"/>
+                    <w:szCs w:val="17"/>
+                  </w:rPr>
+                </w:pPr>
+                <w:r>
+                  <w:rPr>
+                    <w:sz w:val="17"/>
+                    <w:szCs w:val="17"/>
+                    <w:rtl w:val="0"/>
+                  </w:rPr>
+                  <w:t xml:space="preserve">Hidden: official register identifier</w:t>
+                </w:r>
+                <w:r>
+                  <w:rPr>
+                    <w:rFonts w:ascii="Roboto Mono" w:cs="Roboto Mono" w:eastAsia="Roboto Mono" w:hAnsi="Roboto Mono"/>
+                    <w:color w:val="188038"/>
+                    <w:sz w:val="17"/>
+                    <w:szCs w:val="17"/>
+                    <w:rtl w:val="0"/>
+                  </w:rPr>
+                  <w:t xml:space="preserve"/>
+                </w:r>
+                <w:r>
+                  <w:rPr>
+                    <w:rtl w:val="0"/>
+                  </w:rPr>
+                </w:r>
+              </w:p>
+            </w:tc>
+          </w:tr>
+          <w:tr>
+            <w:trPr>
+              <w:cantSplit w:val="0"/>
+              <w:tblHeader w:val="0"/>
+            </w:trPr>
+            <w:tc>
+              <w:tcPr>
+                <w:shd w:fill="auto" w:val="clear"/>
+                <w:tcMar>
+                  <w:top w:w="100.0" w:type="dxa"/>
+                  <w:left w:w="100.0" w:type="dxa"/>
+                  <w:bottom w:w="100.0" w:type="dxa"/>
+                  <w:right w:w="100.0" w:type="dxa"/>
+                </w:tcMar>
+                <w:vAlign w:val="top"/>
+              </w:tcPr>
+              <w:p>
+                <w:pPr>
+                  <w:spacing w:after="0" w:line="276" w:lineRule="auto"/>
+                  <w:rPr>
+                    <w:sz w:val="17"/>
+                    <w:szCs w:val="17"/>
+                  </w:rPr>
+                </w:pPr>
+                <w:r>
+                  <w:rPr>
+                    <w:rFonts w:ascii="Roboto Mono" w:cs="Roboto Mono" w:eastAsia="Roboto Mono" w:hAnsi="Roboto Mono"/>
+                    <w:color w:val="188038"/>
+                    <w:sz w:val="17"/>
+                    <w:szCs w:val="17"/>
+                    <w:rtl w:val="0"/>
+                  </w:rPr>
+                  <w:t xml:space="preserve">sample and stratum fields</w:t>
+                </w:r>
+                <w:r>
+                  <w:rPr>
+                    <w:rtl w:val="0"/>
+                  </w:rPr>
+                </w:r>
+              </w:p>
+            </w:tc>
+            <w:tc>
+              <w:tcPr>
+                <w:shd w:fill="auto" w:val="clear"/>
+                <w:tcMar>
+                  <w:top w:w="100.0" w:type="dxa"/>
+                  <w:left w:w="100.0" w:type="dxa"/>
+                  <w:bottom w:w="100.0" w:type="dxa"/>
+                  <w:right w:w="100.0" w:type="dxa"/>
+                </w:tcMar>
+                <w:vAlign w:val="top"/>
+              </w:tcPr>
+              <w:p>
+                <w:pPr>
+                  <w:spacing w:after="0" w:line="276" w:lineRule="auto"/>
+                  <w:rPr>
+                    <w:sz w:val="17"/>
+                    <w:szCs w:val="17"/>
+                  </w:rPr>
+                </w:pPr>
+                <w:r>
+                  <w:rPr>
+                    <w:sz w:val="17"/>
+                    <w:szCs w:val="17"/>
+                    <w:rtl w:val="0"/>
+                  </w:rPr>
+                  <w:t xml:space="preserve">Hidden: sampling administration</w:t>
+                </w:r>
+                <w:r>
+                  <w:rPr>
+                    <w:rFonts w:ascii="Roboto Mono" w:cs="Roboto Mono" w:eastAsia="Roboto Mono" w:hAnsi="Roboto Mono"/>
+                    <w:color w:val="188038"/>
+                    <w:sz w:val="17"/>
+                    <w:szCs w:val="17"/>
+                    <w:rtl w:val="0"/>
+                  </w:rPr>
+                  <w:t xml:space="preserve"/>
+                </w:r>
+                <w:r>
+                  <w:rPr>
+                    <w:rtl w:val="0"/>
+                  </w:rPr>
+                </w:r>
+              </w:p>
+            </w:tc>
+          </w:tr>
+          <w:tr>
+            <w:trPr>
+              <w:cantSplit w:val="0"/>
+              <w:tblHeader w:val="0"/>
+            </w:trPr>
+            <w:tc>
+              <w:tcPr>
+                <w:shd w:fill="auto" w:val="clear"/>
+                <w:tcMar>
+                  <w:top w:w="100.0" w:type="dxa"/>
+                  <w:left w:w="100.0" w:type="dxa"/>
+                  <w:bottom w:w="100.0" w:type="dxa"/>
+                  <w:right w:w="100.0" w:type="dxa"/>
+                </w:tcMar>
+                <w:vAlign w:val="top"/>
+              </w:tcPr>
+              <w:p>
+                <w:pPr>
+                  <w:spacing w:after="0" w:line="276" w:lineRule="auto"/>
+                  <w:rPr>
+                    <w:sz w:val="17"/>
+                    <w:szCs w:val="17"/>
+                  </w:rPr>
+                </w:pPr>
+                <w:r>
+                  <w:rPr>
+                    <w:rFonts w:ascii="Roboto Mono" w:cs="Roboto Mono" w:eastAsia="Roboto Mono" w:hAnsi="Roboto Mono"/>
+                    <w:color w:val="188038"/>
+                    <w:sz w:val="17"/>
+                    <w:szCs w:val="17"/>
+                    <w:rtl w:val="0"/>
+                  </w:rPr>
+                  <w:t xml:space="preserve">model and comparison fields</w:t>
+                </w:r>
+                <w:r>
+                  <w:rPr>
+                    <w:rtl w:val="0"/>
+                  </w:rPr>
+                </w:r>
+              </w:p>
+            </w:tc>
+            <w:tc>
+              <w:tcPr>
+                <w:shd w:fill="auto" w:val="clear"/>
+                <w:tcMar>
+                  <w:top w:w="100.0" w:type="dxa"/>
+                  <w:left w:w="100.0" w:type="dxa"/>
+                  <w:bottom w:w="100.0" w:type="dxa"/>
+                  <w:right w:w="100.0" w:type="dxa"/>
+                </w:tcMar>
+                <w:vAlign w:val="top"/>
+              </w:tcPr>
+              <w:p>
+                <w:pPr>
+                  <w:spacing w:after="0" w:line="276" w:lineRule="auto"/>
+                  <w:rPr>
+                    <w:sz w:val="17"/>
+                    <w:szCs w:val="17"/>
+                  </w:rPr>
+                </w:pPr>
+                <w:r>
+                  <w:rPr>
+                    <w:sz w:val="17"/>
+                    <w:szCs w:val="17"/>
+                    <w:rtl w:val="0"/>
+                  </w:rPr>
+                  <w:t xml:space="preserve">Hidden: analysis and adjudication provenance</w:t>
+                </w:r>
+                <w:r>
+                  <w:rPr>
+                    <w:rFonts w:ascii="Roboto Mono" w:cs="Roboto Mono" w:eastAsia="Roboto Mono" w:hAnsi="Roboto Mono"/>
+                    <w:color w:val="188038"/>
+                    <w:sz w:val="17"/>
+                    <w:szCs w:val="17"/>
+                    <w:rtl w:val="0"/>
+                  </w:rPr>
+                  <w:t xml:space="preserve"/>
+                </w:r>
+                <w:r>
+                  <w:rPr>
+                    <w:rtl w:val="0"/>
+                  </w:rPr>
                 </w:r>
               </w:p>
             </w:tc>
@@ -13141,8 +13459,8 @@
       </w:r>
     </w:p>
     <w:sectPr>
-      <w:headerReference r:id="rId7" w:type="default"/>
-      <w:footerReference r:id="rId8" w:type="default"/>
+      <w:headerReference ns2:id="rId7" w:type="default"/>
+      <w:footerReference ns2:id="rId8" w:type="default"/>
       <w:pgSz w:h="16838" w:w="11906" w:orient="portrait"/>
       <w:pgMar w:bottom="850" w:top="850" w:left="935" w:right="935" w:header="397" w:footer="397"/>
       <w:pgNumType w:start="1"/>

</xml_diff>